<commit_message>
Kernerl runtime check and baseline integration if deployed
</commit_message>
<xml_diff>
--- a/SNN_Project_Full_Evaluation.docx
+++ b/SNN_Project_Full_Evaluation.docx
@@ -12,7 +12,7 @@
           <w:color w:val="1F497D"/>
           <w:sz w:val="44"/>
         </w:rPr>
-        <w:t>SNNs-auf-GPUs  Full Technical Evaluation</w:t>
+        <w:t>SNNs-auf-GPUs: Full Technical Evaluation</w:t>
       </w:r>
     </w:p>
     <w:p/>
@@ -21,7 +21,121 @@
         <w:jc w:val="center"/>
       </w:pPr>
       <w:r>
-        <w:t>Branch: Operators   |   Date: 04 June 2026   |   Reviewer: Claude Sonnet 4.6</w:t>
+        <w:t>Branch: Operators  |  Date: 04 June 2026  |  Reviewer: Claude Sonnet 4.6</w:t>
+      </w:r>
+    </w:p>
+    <w:p/>
+    <w:p/>
+    <w:p>
+      <w:pPr>
+        <w:jc w:val="center"/>
+      </w:pPr>
+      <w:r>
+        <w:rPr>
+          <w:i/>
+        </w:rPr>
+        <w:t>Status: Active Development -- Research Pre-Production</w:t>
+      </w:r>
+    </w:p>
+    <w:p>
+      <w:r>
+        <w:br w:type="page"/>
+      </w:r>
+    </w:p>
+    <w:p>
+      <w:pPr>
+        <w:pStyle w:val="Heading1"/>
+      </w:pPr>
+      <w:r>
+        <w:rPr>
+          <w:color w:val="1F497D"/>
+        </w:rPr>
+        <w:t>Table of Contents</w:t>
+      </w:r>
+    </w:p>
+    <w:p>
+      <w:r>
+        <w:t>1.  Executive Summary</w:t>
+      </w:r>
+    </w:p>
+    <w:p>
+      <w:r>
+        <w:t>2.  Architecture Overview</w:t>
+      </w:r>
+    </w:p>
+    <w:p>
+      <w:r>
+        <w:t xml:space="preserve">    2.1  End-to-End Data Flow</w:t>
+      </w:r>
+    </w:p>
+    <w:p>
+      <w:r>
+        <w:t xml:space="preserve">    2.2  Kernel Dispatch Routing</w:t>
+      </w:r>
+    </w:p>
+    <w:p>
+      <w:r>
+        <w:t>3.  Component-by-Component Analysis</w:t>
+      </w:r>
+    </w:p>
+    <w:p>
+      <w:r>
+        <w:t xml:space="preserve">    3.1  Configuration Layer (skeleton/)</w:t>
+      </w:r>
+    </w:p>
+    <w:p>
+      <w:r>
+        <w:t xml:space="preserve">    3.2  Data Pipeline (event_data_workflow/)</w:t>
+      </w:r>
+    </w:p>
+    <w:p>
+      <w:r>
+        <w:t xml:space="preserve">    3.3  CRSC Kernel Stack (src/crsc/)</w:t>
+      </w:r>
+    </w:p>
+    <w:p>
+      <w:r>
+        <w:t xml:space="preserve">    3.4  Acceleration Layer (acceleration/)</w:t>
+      </w:r>
+    </w:p>
+    <w:p>
+      <w:r>
+        <w:t xml:space="preserve">    3.5  Compiler and IR (src/compiler/)</w:t>
+      </w:r>
+    </w:p>
+    <w:p>
+      <w:r>
+        <w:t xml:space="preserve">    3.6  Runtime Coordination Layer (src/runtime/)</w:t>
+      </w:r>
+    </w:p>
+    <w:p>
+      <w:r>
+        <w:t xml:space="preserve">    3.7  Learning Layer (src/learning/)</w:t>
+      </w:r>
+    </w:p>
+    <w:p>
+      <w:r>
+        <w:t>4.  Silent Kills -- Full List</w:t>
+      </w:r>
+    </w:p>
+    <w:p>
+      <w:r>
+        <w:t>5.  Silent Wins -- Full List</w:t>
+      </w:r>
+    </w:p>
+    <w:p>
+      <w:r>
+        <w:t>6.  Missing Pieces and Gaps</w:t>
+      </w:r>
+    </w:p>
+    <w:p>
+      <w:r>
+        <w:t>7.  Benchmark Results</w:t>
+      </w:r>
+    </w:p>
+    <w:p>
+      <w:r>
+        <w:t>8.  Verdict and Recommendations</w:t>
       </w:r>
     </w:p>
     <w:p>

</xml_diff>